<commit_message>
feat(x7i): r2 fix heading styles, correct margin metadata, and complete full 44-page visual qa
</commit_message>
<xml_diff>
--- a/work/do-an/output/CHAPTER_2_3_REVIEW.docx
+++ b/work/do-an/output/CHAPTER_2_3_REVIEW.docx
@@ -4,6 +4,7 @@
   <w:body>
     <w:p>
       <w:pPr>
+        <w:pStyle w:val="Heading1"/>
         <w:keepNext/>
         <w:spacing w:before="240" w:after="280"/>
         <w:jc w:val="center"/>
@@ -48,6 +49,7 @@
     </w:p>
     <w:p>
       <w:pPr>
+        <w:pStyle w:val="Heading2"/>
         <w:keepNext/>
         <w:spacing w:before="240" w:after="120"/>
         <w:jc w:val="left"/>
@@ -64,6 +66,7 @@
     </w:p>
     <w:p>
       <w:pPr>
+        <w:pStyle w:val="Heading3"/>
         <w:keepNext/>
         <w:spacing w:before="160" w:after="80"/>
         <w:jc w:val="left"/>
@@ -229,6 +232,7 @@
     </w:p>
     <w:p>
       <w:pPr>
+        <w:pStyle w:val="Heading3"/>
         <w:keepNext/>
         <w:spacing w:before="160" w:after="80"/>
         <w:jc w:val="left"/>
@@ -345,6 +349,7 @@
     </w:p>
     <w:p>
       <w:pPr>
+        <w:pStyle w:val="Heading3"/>
         <w:keepNext/>
         <w:spacing w:before="160" w:after="80"/>
         <w:jc w:val="left"/>
@@ -1272,6 +1277,7 @@
     </w:p>
     <w:p>
       <w:pPr>
+        <w:pStyle w:val="Heading2"/>
         <w:keepNext/>
         <w:spacing w:before="240" w:after="120"/>
         <w:jc w:val="left"/>
@@ -1288,6 +1294,7 @@
     </w:p>
     <w:p>
       <w:pPr>
+        <w:pStyle w:val="Heading3"/>
         <w:keepNext/>
         <w:spacing w:before="160" w:after="80"/>
         <w:jc w:val="left"/>
@@ -1441,6 +1448,7 @@
     </w:p>
     <w:p>
       <w:pPr>
+        <w:pStyle w:val="Heading3"/>
         <w:keepNext/>
         <w:spacing w:before="160" w:after="80"/>
         <w:jc w:val="left"/>
@@ -1644,6 +1652,7 @@
     </w:p>
     <w:p>
       <w:pPr>
+        <w:pStyle w:val="Heading3"/>
         <w:keepNext/>
         <w:spacing w:before="160" w:after="80"/>
         <w:jc w:val="left"/>
@@ -1955,6 +1964,7 @@
     </w:p>
     <w:p>
       <w:pPr>
+        <w:pStyle w:val="Heading3"/>
         <w:keepNext/>
         <w:spacing w:before="160" w:after="80"/>
         <w:jc w:val="left"/>
@@ -2218,6 +2228,7 @@
     </w:p>
     <w:p>
       <w:pPr>
+        <w:pStyle w:val="Heading3"/>
         <w:keepNext/>
         <w:spacing w:before="160" w:after="80"/>
         <w:jc w:val="left"/>
@@ -2357,6 +2368,7 @@
     </w:p>
     <w:p>
       <w:pPr>
+        <w:pStyle w:val="Heading2"/>
         <w:keepNext/>
         <w:spacing w:before="240" w:after="120"/>
         <w:jc w:val="left"/>
@@ -2373,6 +2385,7 @@
     </w:p>
     <w:p>
       <w:pPr>
+        <w:pStyle w:val="Heading3"/>
         <w:keepNext/>
         <w:spacing w:before="160" w:after="80"/>
         <w:jc w:val="left"/>
@@ -2526,6 +2539,7 @@
     </w:p>
     <w:p>
       <w:pPr>
+        <w:pStyle w:val="Heading3"/>
         <w:keepNext/>
         <w:spacing w:before="160" w:after="80"/>
         <w:jc w:val="left"/>
@@ -3520,6 +3534,7 @@
     </w:p>
     <w:p>
       <w:pPr>
+        <w:pStyle w:val="Heading3"/>
         <w:keepNext/>
         <w:spacing w:before="160" w:after="80"/>
         <w:jc w:val="left"/>
@@ -3627,6 +3642,7 @@
     </w:p>
     <w:p>
       <w:pPr>
+        <w:pStyle w:val="Heading2"/>
         <w:keepNext/>
         <w:spacing w:before="240" w:after="120"/>
         <w:jc w:val="left"/>
@@ -3643,6 +3659,7 @@
     </w:p>
     <w:p>
       <w:pPr>
+        <w:pStyle w:val="Heading3"/>
         <w:keepNext/>
         <w:spacing w:before="160" w:after="80"/>
         <w:jc w:val="left"/>
@@ -3750,6 +3767,7 @@
     </w:p>
     <w:p>
       <w:pPr>
+        <w:pStyle w:val="Heading3"/>
         <w:keepNext/>
         <w:spacing w:before="160" w:after="80"/>
         <w:jc w:val="left"/>
@@ -4479,6 +4497,7 @@
     </w:p>
     <w:p>
       <w:pPr>
+        <w:pStyle w:val="Heading3"/>
         <w:keepNext/>
         <w:spacing w:before="160" w:after="80"/>
         <w:jc w:val="left"/>
@@ -4680,6 +4699,7 @@
     </w:p>
     <w:p>
       <w:pPr>
+        <w:pStyle w:val="Heading2"/>
         <w:keepNext/>
         <w:spacing w:before="240" w:after="120"/>
         <w:jc w:val="left"/>
@@ -4696,6 +4716,7 @@
     </w:p>
     <w:p>
       <w:pPr>
+        <w:pStyle w:val="Heading3"/>
         <w:keepNext/>
         <w:spacing w:before="160" w:after="80"/>
         <w:jc w:val="left"/>
@@ -5273,6 +5294,7 @@
     </w:p>
     <w:p>
       <w:pPr>
+        <w:pStyle w:val="Heading3"/>
         <w:keepNext/>
         <w:spacing w:before="160" w:after="80"/>
         <w:jc w:val="left"/>
@@ -5649,6 +5671,7 @@
     </w:p>
     <w:p>
       <w:pPr>
+        <w:pStyle w:val="Heading3"/>
         <w:keepNext/>
         <w:spacing w:before="160" w:after="80"/>
         <w:jc w:val="left"/>
@@ -6205,6 +6228,7 @@
     </w:p>
     <w:p>
       <w:pPr>
+        <w:pStyle w:val="Heading2"/>
         <w:keepNext/>
         <w:spacing w:before="240" w:after="120"/>
         <w:jc w:val="left"/>
@@ -6221,6 +6245,7 @@
     </w:p>
     <w:p>
       <w:pPr>
+        <w:pStyle w:val="Heading3"/>
         <w:keepNext/>
         <w:spacing w:before="160" w:after="80"/>
         <w:jc w:val="left"/>
@@ -6484,6 +6509,7 @@
     </w:p>
     <w:p>
       <w:pPr>
+        <w:pStyle w:val="Heading3"/>
         <w:keepNext/>
         <w:spacing w:before="160" w:after="80"/>
         <w:jc w:val="left"/>
@@ -6575,6 +6601,7 @@
     </w:p>
     <w:p>
       <w:pPr>
+        <w:pStyle w:val="Heading3"/>
         <w:keepNext/>
         <w:spacing w:before="160" w:after="80"/>
         <w:jc w:val="left"/>
@@ -6791,6 +6818,7 @@
     </w:p>
     <w:p>
       <w:pPr>
+        <w:pStyle w:val="Heading2"/>
         <w:keepNext/>
         <w:spacing w:before="240" w:after="120"/>
         <w:jc w:val="left"/>
@@ -6870,6 +6898,7 @@
     </w:p>
     <w:p>
       <w:pPr>
+        <w:pStyle w:val="Heading1"/>
         <w:keepNext/>
         <w:spacing w:before="240" w:after="280"/>
         <w:jc w:val="center"/>
@@ -6878,6 +6907,7 @@
         <w:rPr>
           <w:rFonts w:ascii="Times New Roman" w:hAnsi="Times New Roman"/>
           <w:b/>
+          <w:color w:val="000000"/>
           <w:sz w:val="32"/>
         </w:rPr>
         <w:t>CHƯƠNG 3. KẾT QUẢ THỰC NGHIỆM VÀ PHÂN TÍCH</w:t>
@@ -6885,6 +6915,7 @@
     </w:p>
     <w:p>
       <w:pPr>
+        <w:pStyle w:val="Heading2"/>
         <w:keepNext/>
         <w:spacing w:before="240" w:after="120"/>
         <w:jc w:val="left"/>
@@ -6893,6 +6924,7 @@
         <w:rPr>
           <w:rFonts w:ascii="Times New Roman" w:hAnsi="Times New Roman"/>
           <w:b/>
+          <w:color w:val="000000"/>
           <w:sz w:val="28"/>
         </w:rPr>
         <w:t>3.1. Trạng thái baseline trước đo đạc</w:t>
@@ -6914,6 +6946,7 @@
     </w:p>
     <w:p>
       <w:pPr>
+        <w:pStyle w:val="Heading3"/>
         <w:keepNext/>
         <w:spacing w:before="160" w:after="80"/>
         <w:jc w:val="left"/>
@@ -6923,6 +6956,7 @@
           <w:rFonts w:ascii="Times New Roman" w:hAnsi="Times New Roman"/>
           <w:b/>
           <w:i/>
+          <w:color w:val="000000"/>
           <w:sz w:val="26"/>
         </w:rPr>
         <w:t>3.1.1. Trạng thái mạng và dịch vụ SMB</w:t>
@@ -8459,6 +8493,7 @@
     </w:p>
     <w:p>
       <w:pPr>
+        <w:pStyle w:val="Heading3"/>
         <w:keepNext/>
         <w:spacing w:before="160" w:after="80"/>
         <w:jc w:val="left"/>
@@ -8468,6 +8503,7 @@
           <w:rFonts w:ascii="Times New Roman" w:hAnsi="Times New Roman"/>
           <w:b/>
           <w:i/>
+          <w:color w:val="000000"/>
           <w:sz w:val="26"/>
         </w:rPr>
         <w:t>3.1.2. Trạng thái bản vá và mốc phục hồi</w:t>
@@ -9394,6 +9430,7 @@
     </w:p>
     <w:p>
       <w:pPr>
+        <w:pStyle w:val="Heading2"/>
         <w:keepNext/>
         <w:spacing w:before="240" w:after="120"/>
         <w:jc w:val="left"/>
@@ -9402,6 +9439,7 @@
         <w:rPr>
           <w:rFonts w:ascii="Times New Roman" w:hAnsi="Times New Roman"/>
           <w:b/>
+          <w:color w:val="000000"/>
           <w:sz w:val="28"/>
         </w:rPr>
         <w:t>3.2. Kết quả Kịch bản 1 — Khảo sát dịch vụ SMB</w:t>
@@ -9423,6 +9461,7 @@
     </w:p>
     <w:p>
       <w:pPr>
+        <w:pStyle w:val="Heading3"/>
         <w:keepNext/>
         <w:spacing w:before="160" w:after="80"/>
         <w:jc w:val="left"/>
@@ -9432,6 +9471,7 @@
           <w:rFonts w:ascii="Times New Roman" w:hAnsi="Times New Roman"/>
           <w:b/>
           <w:i/>
+          <w:color w:val="000000"/>
           <w:sz w:val="26"/>
         </w:rPr>
         <w:t>3.2.1. Khảo sát trạm mạng và trạng thái mở cổng dịch vụ SMB</w:t>
@@ -10623,6 +10663,7 @@
     </w:p>
     <w:p>
       <w:pPr>
+        <w:pStyle w:val="Heading3"/>
         <w:keepNext/>
         <w:spacing w:before="160" w:after="80"/>
         <w:jc w:val="left"/>
@@ -10632,6 +10673,7 @@
           <w:rFonts w:ascii="Times New Roman" w:hAnsi="Times New Roman"/>
           <w:b/>
           <w:i/>
+          <w:color w:val="000000"/>
           <w:sz w:val="26"/>
         </w:rPr>
         <w:t>3.2.2. Nhận diện phiên bản dịch vụ và đặc tính giao thức SMB</w:t>
@@ -11041,6 +11083,7 @@
     </w:p>
     <w:p>
       <w:pPr>
+        <w:pStyle w:val="Heading2"/>
         <w:keepNext/>
         <w:spacing w:before="240" w:after="120"/>
         <w:jc w:val="left"/>
@@ -11049,6 +11092,7 @@
         <w:rPr>
           <w:rFonts w:ascii="Times New Roman" w:hAnsi="Times New Roman"/>
           <w:b/>
+          <w:color w:val="000000"/>
           <w:sz w:val="28"/>
         </w:rPr>
         <w:t>3.3. Kết quả Kịch bản 2 — Kiểm tra dấu hiệu MS17-010</w:t>
@@ -11070,6 +11114,7 @@
     </w:p>
     <w:p>
       <w:pPr>
+        <w:pStyle w:val="Heading3"/>
         <w:keepNext/>
         <w:spacing w:before="160" w:after="80"/>
         <w:jc w:val="left"/>
@@ -11079,6 +11124,7 @@
           <w:rFonts w:ascii="Times New Roman" w:hAnsi="Times New Roman"/>
           <w:b/>
           <w:i/>
+          <w:color w:val="000000"/>
           <w:sz w:val="26"/>
         </w:rPr>
         <w:t>3.3.1. Khảo sát điều kiện kết nối và thuộc tính giao thức SMB (NSE-SMB-01 đến NSE-SMB-03)</w:t>
@@ -12272,6 +12318,7 @@
     </w:p>
     <w:p>
       <w:pPr>
+        <w:pStyle w:val="Heading3"/>
         <w:keepNext/>
         <w:spacing w:before="160" w:after="80"/>
         <w:jc w:val="left"/>
@@ -12281,6 +12328,7 @@
           <w:rFonts w:ascii="Times New Roman" w:hAnsi="Times New Roman"/>
           <w:b/>
           <w:i/>
+          <w:color w:val="000000"/>
           <w:sz w:val="26"/>
         </w:rPr>
         <w:t>3.3.2. Đánh giá dấu hiệu lỗ hổng MS17-010 và đối chiếu trạng thái bản vá (NSE-SMB-04)</w:t>
@@ -12756,6 +12804,7 @@
     </w:p>
     <w:p>
       <w:pPr>
+        <w:pStyle w:val="Heading2"/>
         <w:keepNext/>
         <w:spacing w:before="240" w:after="120"/>
         <w:jc w:val="left"/>
@@ -12764,6 +12813,7 @@
         <w:rPr>
           <w:rFonts w:ascii="Times New Roman" w:hAnsi="Times New Roman"/>
           <w:b/>
+          <w:color w:val="000000"/>
           <w:sz w:val="28"/>
         </w:rPr>
         <w:t>3.4. Kết quả Case B — Vô hiệu hóa SMBv1</w:t>
@@ -12785,6 +12835,7 @@
     </w:p>
     <w:p>
       <w:pPr>
+        <w:pStyle w:val="Heading3"/>
         <w:keepNext/>
         <w:spacing w:before="160" w:after="80"/>
         <w:jc w:val="left"/>
@@ -12794,6 +12845,7 @@
           <w:rFonts w:ascii="Times New Roman" w:hAnsi="Times New Roman"/>
           <w:b/>
           <w:i/>
+          <w:color w:val="000000"/>
           <w:sz w:val="26"/>
         </w:rPr>
         <w:t>3.4.1. Thao tác vô hiệu hóa SMBv1 và kiểm tra trạng thái máy chủ cục bộ</w:t>
@@ -15137,6 +15189,7 @@
     </w:p>
     <w:p>
       <w:pPr>
+        <w:pStyle w:val="Heading3"/>
         <w:keepNext/>
         <w:spacing w:before="160" w:after="80"/>
         <w:jc w:val="left"/>
@@ -15146,6 +15199,7 @@
           <w:rFonts w:ascii="Times New Roman" w:hAnsi="Times New Roman"/>
           <w:b/>
           <w:i/>
+          <w:color w:val="000000"/>
           <w:sz w:val="26"/>
         </w:rPr>
         <w:t>3.4.2. Kết quả đo đạc lại từ xa và đối chiếu đa tầng</w:t>
@@ -15623,6 +15677,7 @@
     </w:p>
     <w:p>
       <w:pPr>
+        <w:pStyle w:val="Heading2"/>
         <w:keepNext/>
         <w:spacing w:before="240" w:after="120"/>
         <w:jc w:val="left"/>
@@ -15631,6 +15686,7 @@
         <w:rPr>
           <w:rFonts w:ascii="Times New Roman" w:hAnsi="Times New Roman"/>
           <w:b/>
+          <w:color w:val="000000"/>
           <w:sz w:val="28"/>
         </w:rPr>
         <w:t>3.5. Kết quả Case C — Kiểm soát SMB bằng pfSense</w:t>
@@ -15652,6 +15708,7 @@
     </w:p>
     <w:p>
       <w:pPr>
+        <w:pStyle w:val="Heading3"/>
         <w:keepNext/>
         <w:spacing w:before="160" w:after="80"/>
         <w:jc w:val="left"/>
@@ -15661,6 +15718,7 @@
           <w:rFonts w:ascii="Times New Roman" w:hAnsi="Times New Roman"/>
           <w:b/>
           <w:i/>
+          <w:color w:val="000000"/>
           <w:sz w:val="26"/>
         </w:rPr>
         <w:t>3.5.1. Thiết lập cầu nối pfSense và chính sách kiểm soát lưu lượng SMB</w:t>
@@ -17661,6 +17719,7 @@
     </w:p>
     <w:p>
       <w:pPr>
+        <w:pStyle w:val="Heading3"/>
         <w:keepNext/>
         <w:spacing w:before="160" w:after="80"/>
         <w:jc w:val="left"/>
@@ -17670,6 +17729,7 @@
           <w:rFonts w:ascii="Times New Roman" w:hAnsi="Times New Roman"/>
           <w:b/>
           <w:i/>
+          <w:color w:val="000000"/>
           <w:sz w:val="26"/>
         </w:rPr>
         <w:t>3.5.2. Kết quả đo đạc từ xa, đối chiếu nhật ký tường lửa và trạng thái máy chủ</w:t>
@@ -18261,6 +18321,7 @@
     </w:p>
     <w:p>
       <w:pPr>
+        <w:pStyle w:val="Heading2"/>
         <w:keepNext/>
         <w:spacing w:before="240" w:after="120"/>
         <w:jc w:val="left"/>
@@ -18269,6 +18330,7 @@
         <w:rPr>
           <w:rFonts w:ascii="Times New Roman" w:hAnsi="Times New Roman"/>
           <w:b/>
+          <w:color w:val="000000"/>
           <w:sz w:val="28"/>
         </w:rPr>
         <w:t>3.6. So sánh kết quả thực nghiệm</w:t>
@@ -19835,6 +19897,7 @@
     </w:p>
     <w:p>
       <w:pPr>
+        <w:pStyle w:val="Heading2"/>
         <w:keepNext/>
         <w:spacing w:before="240" w:after="120"/>
         <w:jc w:val="left"/>
@@ -19843,6 +19906,7 @@
         <w:rPr>
           <w:rFonts w:ascii="Times New Roman" w:hAnsi="Times New Roman"/>
           <w:b/>
+          <w:color w:val="000000"/>
           <w:sz w:val="28"/>
         </w:rPr>
         <w:t>3.7. Tổng kết chương</w:t>
@@ -20399,15 +20463,16 @@
     <w:pPr>
       <w:keepNext/>
       <w:keepLines/>
-      <w:spacing w:before="480" w:after="0"/>
+      <w:spacing w:before="240" w:after="280"/>
+      <w:jc w:val="center"/>
       <w:outlineLvl w:val="0"/>
     </w:pPr>
     <w:rPr>
-      <w:rFonts w:asciiTheme="majorHAnsi" w:eastAsiaTheme="majorEastAsia" w:hAnsiTheme="majorHAnsi" w:cstheme="majorBidi"/>
+      <w:rFonts w:asciiTheme="majorHAnsi" w:eastAsiaTheme="majorEastAsia" w:hAnsiTheme="majorHAnsi" w:cstheme="majorBidi" w:ascii="Times New Roman" w:hAnsi="Times New Roman"/>
       <w:b/>
       <w:bCs/>
-      <w:color w:val="365F91" w:themeColor="accent1" w:themeShade="BF"/>
-      <w:sz w:val="28"/>
+      <w:color w:val="000000"/>
+      <w:sz w:val="32"/>
       <w:szCs w:val="28"/>
     </w:rPr>
   </w:style>
@@ -20423,15 +20488,16 @@
     <w:pPr>
       <w:keepNext/>
       <w:keepLines/>
-      <w:spacing w:before="200" w:after="0"/>
+      <w:spacing w:before="240" w:after="120"/>
+      <w:jc w:val="left"/>
       <w:outlineLvl w:val="1"/>
     </w:pPr>
     <w:rPr>
-      <w:rFonts w:asciiTheme="majorHAnsi" w:eastAsiaTheme="majorEastAsia" w:hAnsiTheme="majorHAnsi" w:cstheme="majorBidi"/>
+      <w:rFonts w:asciiTheme="majorHAnsi" w:eastAsiaTheme="majorEastAsia" w:hAnsiTheme="majorHAnsi" w:cstheme="majorBidi" w:ascii="Times New Roman" w:hAnsi="Times New Roman"/>
       <w:b/>
       <w:bCs/>
-      <w:color w:val="4F81BD" w:themeColor="accent1"/>
-      <w:sz w:val="26"/>
+      <w:color w:val="000000"/>
+      <w:sz w:val="28"/>
       <w:szCs w:val="26"/>
     </w:rPr>
   </w:style>
@@ -20447,14 +20513,17 @@
     <w:pPr>
       <w:keepNext/>
       <w:keepLines/>
-      <w:spacing w:before="200" w:after="0"/>
+      <w:spacing w:before="160" w:after="80"/>
+      <w:jc w:val="left"/>
       <w:outlineLvl w:val="2"/>
     </w:pPr>
     <w:rPr>
-      <w:rFonts w:asciiTheme="majorHAnsi" w:eastAsiaTheme="majorEastAsia" w:hAnsiTheme="majorHAnsi" w:cstheme="majorBidi"/>
+      <w:rFonts w:asciiTheme="majorHAnsi" w:eastAsiaTheme="majorEastAsia" w:hAnsiTheme="majorHAnsi" w:cstheme="majorBidi" w:ascii="Times New Roman" w:hAnsi="Times New Roman"/>
       <w:b/>
       <w:bCs/>
-      <w:color w:val="4F81BD" w:themeColor="accent1"/>
+      <w:i/>
+      <w:color w:val="000000"/>
+      <w:sz w:val="26"/>
     </w:rPr>
   </w:style>
   <w:style w:type="paragraph" w:styleId="Heading4">

</xml_diff>